<commit_message>
Update documentation for margin creation and resolution options
Enhance the `generate-prd.mjs` script to include detailed information on both automatic and manual margin (هامش) creation processes, as well as the available resolution options for these cases. Also, update the associated PRD Word document and agent metadata.

Replit-Commit-Author: Agent
Replit-Commit-Session-Id: 25bbfc45-c620-415c-95bc-3216d0eb68da
Replit-Commit-Checkpoint-Type: full_checkpoint
Replit-Commit-Event-Id: bf3b907f-f3e6-4590-afb2-01fb382935d3
Replit-Commit-Screenshot-Url: https://storage.googleapis.com/screenshot-production-us-central1/957fbeeb-9123-422e-a08d-ec0cd98f4451/25bbfc45-c620-415c-95bc-3216d0eb68da/y3Esb6p
Replit-Helium-Checkpoint-Created: true
</commit_message>
<xml_diff>
--- a/PRD_ملفات_التجارة_المحلية.docx
+++ b/PRD_ملفات_التجارة_المحلية.docx
@@ -5401,7 +5401,7 @@
           <w:sz w:val="20"/>
           <w:szCs w:val="20"/>
         </w:rPr>
-        <w:t xml:space="preserve">   • يعرض حالات الهامش الناتجة عن نواقص عند استلام الفواتير</w:t>
+        <w:t xml:space="preserve">   • يعرض جميع حالات الهامش والنواقص المرتبطة بالملف</w:t>
       </w:r>
     </w:p>
     <w:p>
@@ -5435,7 +5435,634 @@
           <w:sz w:val="20"/>
           <w:szCs w:val="20"/>
         </w:rPr>
-        <w:t xml:space="preserve">   • حالات الحل: قبول مرتجع / استبدال / خصم من القيمة / تالف / رفض</w:t>
+        <w:t xml:space="preserve">   • فلتر الحالة: تحت الفحص / تم الحل</w:t>
+      </w:r>
+    </w:p>
+    <w:p>
+      <w:r>
+        <w:rPr>
+          <w:sz w:val="14"/>
+          <w:szCs w:val="14"/>
+        </w:rPr>
+        <w:t xml:space="preserve"> </w:t>
+      </w:r>
+    </w:p>
+    <w:p>
+      <w:pPr>
+        <w:bidi/>
+        <w:spacing w:after="120" w:before="120"/>
+        <w:jc w:val="right"/>
+      </w:pPr>
+      <w:r>
+        <w:rPr>
+          <w:rFonts w:ascii="Cairo" w:cs="Cairo" w:eastAsia="Cairo" w:hAnsi="Cairo"/>
+          <w:b/>
+          <w:bCs/>
+          <w:color w:val="1E293B"/>
+          <w:sz w:val="24"/>
+          <w:szCs w:val="24"/>
+        </w:rPr>
+        <w:t xml:space="preserve">○ طرق إضافة حالة هامش:</w:t>
+      </w:r>
+    </w:p>
+    <w:p>
+      <w:pPr>
+        <w:shd w:fill="2563EB" w:color="2563EB" w:val="solid"/>
+        <w:bidi/>
+        <w:spacing w:after="0" w:before="100"/>
+        <w:jc w:val="right"/>
+      </w:pPr>
+      <w:r>
+        <w:rPr>
+          <w:rFonts w:ascii="Cairo" w:cs="Cairo" w:eastAsia="Cairo" w:hAnsi="Cairo"/>
+          <w:b/>
+          <w:bCs/>
+          <w:color w:val="FFFFFF"/>
+          <w:sz w:val="21"/>
+          <w:szCs w:val="21"/>
+        </w:rPr>
+        <w:t xml:space="preserve">  الطريقة ١ — تلقائية (عند استلام الفاتورة)  </w:t>
+      </w:r>
+    </w:p>
+    <w:p>
+      <w:pPr>
+        <w:shd w:fill="EFF6FF" w:color="EFF6FF" w:val="solid"/>
+        <w:bidi/>
+        <w:spacing w:after="30" w:before="30"/>
+        <w:ind w:start="288"/>
+        <w:jc w:val="right"/>
+      </w:pPr>
+      <w:r>
+        <w:rPr>
+          <w:rFonts w:ascii="Cairo" w:cs="Cairo" w:eastAsia="Cairo" w:hAnsi="Cairo"/>
+          <w:color w:val="1E293B"/>
+          <w:sz w:val="20"/>
+          <w:szCs w:val="20"/>
+        </w:rPr>
+        <w:t xml:space="preserve">• عند فتح نموذج استلام فاتورة وإدخال كمية مستلمة أقل من المطلوب في أي سطر</w:t>
+      </w:r>
+    </w:p>
+    <w:p>
+      <w:pPr>
+        <w:shd w:fill="EFF6FF" w:color="EFF6FF" w:val="solid"/>
+        <w:bidi/>
+        <w:spacing w:after="30" w:before="30"/>
+        <w:ind w:start="288"/>
+        <w:jc w:val="right"/>
+      </w:pPr>
+      <w:r>
+        <w:rPr>
+          <w:rFonts w:ascii="Cairo" w:cs="Cairo" w:eastAsia="Cairo" w:hAnsi="Cairo"/>
+          <w:color w:val="1E293B"/>
+          <w:sz w:val="20"/>
+          <w:szCs w:val="20"/>
+        </w:rPr>
+        <w:t xml:space="preserve">• النظام يحسب الفرق تلقائياً ويعرض تنبيه: 'سيتم إنشاء X قيد هامش تلقائياً للنواقص'</w:t>
+      </w:r>
+    </w:p>
+    <w:p>
+      <w:pPr>
+        <w:shd w:fill="EFF6FF" w:color="EFF6FF" w:val="solid"/>
+        <w:bidi/>
+        <w:spacing w:after="30" w:before="30"/>
+        <w:ind w:start="288"/>
+        <w:jc w:val="right"/>
+      </w:pPr>
+      <w:r>
+        <w:rPr>
+          <w:rFonts w:ascii="Cairo" w:cs="Cairo" w:eastAsia="Cairo" w:hAnsi="Cairo"/>
+          <w:color w:val="1E293B"/>
+          <w:sz w:val="20"/>
+          <w:szCs w:val="20"/>
+        </w:rPr>
+        <w:t xml:space="preserve">• عند تأكيد الاستلام تُنشأ حالة هامش لكل سطر به نقص بالكميات والقيمة المحسوبة</w:t>
+      </w:r>
+    </w:p>
+    <w:p>
+      <w:pPr>
+        <w:spacing w:after="100"/>
+      </w:pPr>
+      <w:r>
+        <w:rPr>
+          <w:sz w:val="4"/>
+          <w:szCs w:val="4"/>
+        </w:rPr>
+        <w:t xml:space="preserve"> </w:t>
+      </w:r>
+    </w:p>
+    <w:p>
+      <w:pPr>
+        <w:shd w:fill="16A34A" w:color="16A34A" w:val="solid"/>
+        <w:bidi/>
+        <w:spacing w:after="0" w:before="100"/>
+        <w:jc w:val="right"/>
+      </w:pPr>
+      <w:r>
+        <w:rPr>
+          <w:rFonts w:ascii="Cairo" w:cs="Cairo" w:eastAsia="Cairo" w:hAnsi="Cairo"/>
+          <w:b/>
+          <w:bCs/>
+          <w:color w:val="FFFFFF"/>
+          <w:sz w:val="21"/>
+          <w:szCs w:val="21"/>
+        </w:rPr>
+        <w:t xml:space="preserve">  الطريقة ٢ — يدوية (من صفحة الهوامش)  </w:t>
+      </w:r>
+    </w:p>
+    <w:p>
+      <w:pPr>
+        <w:shd w:fill="F0FDF4" w:color="F0FDF4" w:val="solid"/>
+        <w:bidi/>
+        <w:spacing w:after="30" w:before="30"/>
+        <w:ind w:start="288"/>
+        <w:jc w:val="right"/>
+      </w:pPr>
+      <w:r>
+        <w:rPr>
+          <w:rFonts w:ascii="Cairo" w:cs="Cairo" w:eastAsia="Cairo" w:hAnsi="Cairo"/>
+          <w:color w:val="1E293B"/>
+          <w:sz w:val="20"/>
+          <w:szCs w:val="20"/>
+        </w:rPr>
+        <w:t xml:space="preserve">• المسار: التجارة المحلية ← الهوامش  →  زر 'حالة هامش جديدة'</w:t>
+      </w:r>
+    </w:p>
+    <w:p>
+      <w:pPr>
+        <w:shd w:fill="F0FDF4" w:color="F0FDF4" w:val="solid"/>
+        <w:bidi/>
+        <w:spacing w:after="30" w:before="30"/>
+        <w:ind w:start="288"/>
+        <w:jc w:val="right"/>
+      </w:pPr>
+      <w:r>
+        <w:rPr>
+          <w:rFonts w:ascii="Cairo" w:cs="Cairo" w:eastAsia="Cairo" w:hAnsi="Cairo"/>
+          <w:color w:val="1E293B"/>
+          <w:sz w:val="20"/>
+          <w:szCs w:val="20"/>
+        </w:rPr>
+        <w:t xml:space="preserve">• حقل الطرف: اختيار الملف (تاجر أو عميل) من قائمة بحث</w:t>
+      </w:r>
+    </w:p>
+    <w:p>
+      <w:pPr>
+        <w:shd w:fill="F0FDF4" w:color="F0FDF4" w:val="solid"/>
+        <w:bidi/>
+        <w:spacing w:after="30" w:before="30"/>
+        <w:ind w:start="288"/>
+        <w:jc w:val="right"/>
+      </w:pPr>
+      <w:r>
+        <w:rPr>
+          <w:rFonts w:ascii="Cairo" w:cs="Cairo" w:eastAsia="Cairo" w:hAnsi="Cairo"/>
+          <w:color w:val="1E293B"/>
+          <w:sz w:val="20"/>
+          <w:szCs w:val="20"/>
+        </w:rPr>
+        <w:t xml:space="preserve">• حقل الفاتورة: اختيار الفاتورة المرتبطة بالطرف المحدد</w:t>
+      </w:r>
+    </w:p>
+    <w:p>
+      <w:pPr>
+        <w:shd w:fill="F0FDF4" w:color="F0FDF4" w:val="solid"/>
+        <w:bidi/>
+        <w:spacing w:after="30" w:before="30"/>
+        <w:ind w:start="288"/>
+        <w:jc w:val="right"/>
+      </w:pPr>
+      <w:r>
+        <w:rPr>
+          <w:rFonts w:ascii="Cairo" w:cs="Cairo" w:eastAsia="Cairo" w:hAnsi="Cairo"/>
+          <w:color w:val="1E293B"/>
+          <w:sz w:val="20"/>
+          <w:szCs w:val="20"/>
+        </w:rPr>
+        <w:t xml:space="preserve">• حقل الوصف: شرح نصي للمشكلة أو سبب الهامش (إلزامي)</w:t>
+      </w:r>
+    </w:p>
+    <w:p>
+      <w:pPr>
+        <w:shd w:fill="F0FDF4" w:color="F0FDF4" w:val="solid"/>
+        <w:bidi/>
+        <w:spacing w:after="30" w:before="30"/>
+        <w:ind w:start="288"/>
+        <w:jc w:val="right"/>
+      </w:pPr>
+      <w:r>
+        <w:rPr>
+          <w:rFonts w:ascii="Cairo" w:cs="Cairo" w:eastAsia="Cairo" w:hAnsi="Cairo"/>
+          <w:color w:val="1E293B"/>
+          <w:sz w:val="20"/>
+          <w:szCs w:val="20"/>
+        </w:rPr>
+        <w:t xml:space="preserve">• الحالة الافتراضية عند الإنشاء: 'تحت الفحص'</w:t>
+      </w:r>
+    </w:p>
+    <w:p>
+      <w:pPr>
+        <w:spacing w:after="100"/>
+      </w:pPr>
+      <w:r>
+        <w:rPr>
+          <w:sz w:val="4"/>
+          <w:szCs w:val="4"/>
+        </w:rPr>
+        <w:t xml:space="preserve"> </w:t>
+      </w:r>
+    </w:p>
+    <w:p>
+      <w:pPr>
+        <w:bidi/>
+        <w:spacing w:after="120" w:before="120"/>
+        <w:jc w:val="right"/>
+      </w:pPr>
+      <w:r>
+        <w:rPr>
+          <w:rFonts w:ascii="Cairo" w:cs="Cairo" w:eastAsia="Cairo" w:hAnsi="Cairo"/>
+          <w:b/>
+          <w:bCs/>
+          <w:color w:val="1E293B"/>
+          <w:sz w:val="24"/>
+          <w:szCs w:val="24"/>
+        </w:rPr>
+        <w:t xml:space="preserve">○ خيارات تسوية حالة الهامش:</w:t>
+      </w:r>
+    </w:p>
+    <w:tbl>
+      <w:tblPr>
+        <w:tblW w:type="pct" w:w="100%"/>
+        <w:tblBorders>
+          <w:top w:val="single" w:color="CBD5E1" w:sz="4"/>
+          <w:left w:val="single" w:color="CBD5E1" w:sz="4"/>
+          <w:bottom w:val="single" w:color="CBD5E1" w:sz="4"/>
+          <w:right w:val="single" w:color="CBD5E1" w:sz="4"/>
+          <w:insideH w:val="single" w:color="auto" w:sz="4"/>
+          <w:insideV w:val="single" w:color="auto" w:sz="4"/>
+        </w:tblBorders>
+      </w:tblPr>
+      <w:tblGrid>
+        <w:gridCol w:w="100"/>
+        <w:gridCol w:w="100"/>
+        <w:gridCol w:w="100"/>
+      </w:tblGrid>
+      <w:tr>
+        <w:trPr>
+          <w:tblHeader/>
+        </w:trPr>
+        <w:tc>
+          <w:tcPr>
+            <w:tcW w:type="dxa" w:w="4500"/>
+            <w:shd w:fill="1E3A5F" w:color="1E3A5F" w:val="solid"/>
+          </w:tcPr>
+          <w:p>
+            <w:pPr>
+              <w:bidi/>
+              <w:spacing w:after="60" w:before="60"/>
+              <w:jc w:val="center"/>
+            </w:pPr>
+            <w:r>
+              <w:rPr>
+                <w:rFonts w:ascii="Cairo" w:cs="Cairo" w:eastAsia="Cairo" w:hAnsi="Cairo"/>
+                <w:b/>
+                <w:bCs/>
+                <w:color w:val="FFFFFF"/>
+                <w:sz w:val="20"/>
+                <w:szCs w:val="20"/>
+              </w:rPr>
+              <w:t xml:space="preserve">الوصف</w:t>
+            </w:r>
+          </w:p>
+        </w:tc>
+        <w:tc>
+          <w:tcPr>
+            <w:tcW w:type="dxa" w:w="2000"/>
+            <w:shd w:fill="1E3A5F" w:color="1E3A5F" w:val="solid"/>
+          </w:tcPr>
+          <w:p>
+            <w:pPr>
+              <w:bidi/>
+              <w:spacing w:after="60" w:before="60"/>
+              <w:jc w:val="center"/>
+            </w:pPr>
+            <w:r>
+              <w:rPr>
+                <w:rFonts w:ascii="Cairo" w:cs="Cairo" w:eastAsia="Cairo" w:hAnsi="Cairo"/>
+                <w:b/>
+                <w:bCs/>
+                <w:color w:val="FFFFFF"/>
+                <w:sz w:val="20"/>
+                <w:szCs w:val="20"/>
+              </w:rPr>
+              <w:t xml:space="preserve">يطلب مبلغ؟</w:t>
+            </w:r>
+          </w:p>
+        </w:tc>
+        <w:tc>
+          <w:tcPr>
+            <w:tcW w:type="dxa" w:w="2500"/>
+            <w:shd w:fill="1E3A5F" w:color="1E3A5F" w:val="solid"/>
+          </w:tcPr>
+          <w:p>
+            <w:pPr>
+              <w:bidi/>
+              <w:spacing w:after="60" w:before="60"/>
+              <w:jc w:val="center"/>
+            </w:pPr>
+            <w:r>
+              <w:rPr>
+                <w:rFonts w:ascii="Cairo" w:cs="Cairo" w:eastAsia="Cairo" w:hAnsi="Cairo"/>
+                <w:b/>
+                <w:bCs/>
+                <w:color w:val="FFFFFF"/>
+                <w:sz w:val="20"/>
+                <w:szCs w:val="20"/>
+              </w:rPr>
+              <w:t xml:space="preserve">خيار التسوية</w:t>
+            </w:r>
+          </w:p>
+        </w:tc>
+      </w:tr>
+      <w:tr>
+        <w:tc>
+          <w:tcPr>
+            <w:tcW w:type="dxa" w:w="4500"/>
+            <w:shd w:fill="FFFFFF" w:color="FFFFFF" w:val="solid"/>
+          </w:tcPr>
+          <w:p>
+            <w:pPr>
+              <w:bidi/>
+              <w:spacing w:after="50" w:before="50"/>
+              <w:jc w:val="right"/>
+            </w:pPr>
+            <w:r>
+              <w:rPr>
+                <w:rFonts w:ascii="Cairo" w:cs="Cairo" w:eastAsia="Cairo" w:hAnsi="Cairo"/>
+                <w:color w:val="1E293B"/>
+                <w:sz w:val="19"/>
+                <w:szCs w:val="19"/>
+              </w:rPr>
+              <w:t xml:space="preserve">قبول الهامش وتسوية القيمة مع الطرف</w:t>
+            </w:r>
+          </w:p>
+        </w:tc>
+        <w:tc>
+          <w:tcPr>
+            <w:tcW w:type="dxa" w:w="2000"/>
+            <w:shd w:fill="FFFFFF" w:color="FFFFFF" w:val="solid"/>
+          </w:tcPr>
+          <w:p>
+            <w:pPr>
+              <w:bidi/>
+              <w:spacing w:after="50" w:before="50"/>
+              <w:jc w:val="right"/>
+            </w:pPr>
+            <w:r>
+              <w:rPr>
+                <w:rFonts w:ascii="Cairo" w:cs="Cairo" w:eastAsia="Cairo" w:hAnsi="Cairo"/>
+                <w:color w:val="1E293B"/>
+                <w:sz w:val="19"/>
+                <w:szCs w:val="19"/>
+              </w:rPr>
+              <w:t xml:space="preserve">نعم</w:t>
+            </w:r>
+          </w:p>
+        </w:tc>
+        <w:tc>
+          <w:tcPr>
+            <w:tcW w:type="dxa" w:w="2500"/>
+            <w:shd w:fill="FFFFFF" w:color="FFFFFF" w:val="solid"/>
+          </w:tcPr>
+          <w:p>
+            <w:pPr>
+              <w:bidi/>
+              <w:spacing w:after="50" w:before="50"/>
+              <w:jc w:val="right"/>
+            </w:pPr>
+            <w:r>
+              <w:rPr>
+                <w:rFonts w:ascii="Cairo" w:cs="Cairo" w:eastAsia="Cairo" w:hAnsi="Cairo"/>
+                <w:color w:val="1E293B"/>
+                <w:sz w:val="19"/>
+                <w:szCs w:val="19"/>
+              </w:rPr>
+              <w:t xml:space="preserve">هامش مقبول</w:t>
+            </w:r>
+          </w:p>
+        </w:tc>
+      </w:tr>
+      <w:tr>
+        <w:tc>
+          <w:tcPr>
+            <w:tcW w:type="dxa" w:w="4500"/>
+            <w:shd w:fill="F8FAFC" w:color="F8FAFC" w:val="solid"/>
+          </w:tcPr>
+          <w:p>
+            <w:pPr>
+              <w:bidi/>
+              <w:spacing w:after="50" w:before="50"/>
+              <w:jc w:val="right"/>
+            </w:pPr>
+            <w:r>
+              <w:rPr>
+                <w:rFonts w:ascii="Cairo" w:cs="Cairo" w:eastAsia="Cairo" w:hAnsi="Cairo"/>
+                <w:color w:val="1E293B"/>
+                <w:sz w:val="19"/>
+                <w:szCs w:val="19"/>
+              </w:rPr>
+              <w:t xml:space="preserve">استبدال المنتج بآخر مماثل</w:t>
+            </w:r>
+          </w:p>
+        </w:tc>
+        <w:tc>
+          <w:tcPr>
+            <w:tcW w:type="dxa" w:w="2000"/>
+            <w:shd w:fill="F8FAFC" w:color="F8FAFC" w:val="solid"/>
+          </w:tcPr>
+          <w:p>
+            <w:pPr>
+              <w:bidi/>
+              <w:spacing w:after="50" w:before="50"/>
+              <w:jc w:val="right"/>
+            </w:pPr>
+            <w:r>
+              <w:rPr>
+                <w:rFonts w:ascii="Cairo" w:cs="Cairo" w:eastAsia="Cairo" w:hAnsi="Cairo"/>
+                <w:color w:val="1E293B"/>
+                <w:sz w:val="19"/>
+                <w:szCs w:val="19"/>
+              </w:rPr>
+              <w:t xml:space="preserve">لا</w:t>
+            </w:r>
+          </w:p>
+        </w:tc>
+        <w:tc>
+          <w:tcPr>
+            <w:tcW w:type="dxa" w:w="2500"/>
+            <w:shd w:fill="F8FAFC" w:color="F8FAFC" w:val="solid"/>
+          </w:tcPr>
+          <w:p>
+            <w:pPr>
+              <w:bidi/>
+              <w:spacing w:after="50" w:before="50"/>
+              <w:jc w:val="right"/>
+            </w:pPr>
+            <w:r>
+              <w:rPr>
+                <w:rFonts w:ascii="Cairo" w:cs="Cairo" w:eastAsia="Cairo" w:hAnsi="Cairo"/>
+                <w:color w:val="1E293B"/>
+                <w:sz w:val="19"/>
+                <w:szCs w:val="19"/>
+              </w:rPr>
+              <w:t xml:space="preserve">استبدال</w:t>
+            </w:r>
+          </w:p>
+        </w:tc>
+      </w:tr>
+      <w:tr>
+        <w:tc>
+          <w:tcPr>
+            <w:tcW w:type="dxa" w:w="4500"/>
+            <w:shd w:fill="FFFFFF" w:color="FFFFFF" w:val="solid"/>
+          </w:tcPr>
+          <w:p>
+            <w:pPr>
+              <w:bidi/>
+              <w:spacing w:after="50" w:before="50"/>
+              <w:jc w:val="right"/>
+            </w:pPr>
+            <w:r>
+              <w:rPr>
+                <w:rFonts w:ascii="Cairo" w:cs="Cairo" w:eastAsia="Cairo" w:hAnsi="Cairo"/>
+                <w:color w:val="1E293B"/>
+                <w:sz w:val="19"/>
+                <w:szCs w:val="19"/>
+              </w:rPr>
+              <w:t xml:space="preserve">خصم قيمة المنتج من حساب الطرف</w:t>
+            </w:r>
+          </w:p>
+        </w:tc>
+        <w:tc>
+          <w:tcPr>
+            <w:tcW w:type="dxa" w:w="2000"/>
+            <w:shd w:fill="FFFFFF" w:color="FFFFFF" w:val="solid"/>
+          </w:tcPr>
+          <w:p>
+            <w:pPr>
+              <w:bidi/>
+              <w:spacing w:after="50" w:before="50"/>
+              <w:jc w:val="right"/>
+            </w:pPr>
+            <w:r>
+              <w:rPr>
+                <w:rFonts w:ascii="Cairo" w:cs="Cairo" w:eastAsia="Cairo" w:hAnsi="Cairo"/>
+                <w:color w:val="1E293B"/>
+                <w:sz w:val="19"/>
+                <w:szCs w:val="19"/>
+              </w:rPr>
+              <w:t xml:space="preserve">نعم</w:t>
+            </w:r>
+          </w:p>
+        </w:tc>
+        <w:tc>
+          <w:tcPr>
+            <w:tcW w:type="dxa" w:w="2500"/>
+            <w:shd w:fill="FFFFFF" w:color="FFFFFF" w:val="solid"/>
+          </w:tcPr>
+          <w:p>
+            <w:pPr>
+              <w:bidi/>
+              <w:spacing w:after="50" w:before="50"/>
+              <w:jc w:val="right"/>
+            </w:pPr>
+            <w:r>
+              <w:rPr>
+                <w:rFonts w:ascii="Cairo" w:cs="Cairo" w:eastAsia="Cairo" w:hAnsi="Cairo"/>
+                <w:color w:val="1E293B"/>
+                <w:sz w:val="19"/>
+                <w:szCs w:val="19"/>
+              </w:rPr>
+              <w:t xml:space="preserve">خصم القيمة</w:t>
+            </w:r>
+          </w:p>
+        </w:tc>
+      </w:tr>
+      <w:tr>
+        <w:tc>
+          <w:tcPr>
+            <w:tcW w:type="dxa" w:w="4500"/>
+            <w:shd w:fill="F8FAFC" w:color="F8FAFC" w:val="solid"/>
+          </w:tcPr>
+          <w:p>
+            <w:pPr>
+              <w:bidi/>
+              <w:spacing w:after="50" w:before="50"/>
+              <w:jc w:val="right"/>
+            </w:pPr>
+            <w:r>
+              <w:rPr>
+                <w:rFonts w:ascii="Cairo" w:cs="Cairo" w:eastAsia="Cairo" w:hAnsi="Cairo"/>
+                <w:color w:val="1E293B"/>
+                <w:sz w:val="19"/>
+                <w:szCs w:val="19"/>
+              </w:rPr>
+              <w:t xml:space="preserve">شطب المنتج كتالف بدون مطالبة مالية</w:t>
+            </w:r>
+          </w:p>
+        </w:tc>
+        <w:tc>
+          <w:tcPr>
+            <w:tcW w:type="dxa" w:w="2000"/>
+            <w:shd w:fill="F8FAFC" w:color="F8FAFC" w:val="solid"/>
+          </w:tcPr>
+          <w:p>
+            <w:pPr>
+              <w:bidi/>
+              <w:spacing w:after="50" w:before="50"/>
+              <w:jc w:val="right"/>
+            </w:pPr>
+            <w:r>
+              <w:rPr>
+                <w:rFonts w:ascii="Cairo" w:cs="Cairo" w:eastAsia="Cairo" w:hAnsi="Cairo"/>
+                <w:color w:val="1E293B"/>
+                <w:sz w:val="19"/>
+                <w:szCs w:val="19"/>
+              </w:rPr>
+              <w:t xml:space="preserve">لا</w:t>
+            </w:r>
+          </w:p>
+        </w:tc>
+        <w:tc>
+          <w:tcPr>
+            <w:tcW w:type="dxa" w:w="2500"/>
+            <w:shd w:fill="F8FAFC" w:color="F8FAFC" w:val="solid"/>
+          </w:tcPr>
+          <w:p>
+            <w:pPr>
+              <w:bidi/>
+              <w:spacing w:after="50" w:before="50"/>
+              <w:jc w:val="right"/>
+            </w:pPr>
+            <w:r>
+              <w:rPr>
+                <w:rFonts w:ascii="Cairo" w:cs="Cairo" w:eastAsia="Cairo" w:hAnsi="Cairo"/>
+                <w:color w:val="1E293B"/>
+                <w:sz w:val="19"/>
+                <w:szCs w:val="19"/>
+              </w:rPr>
+              <w:t xml:space="preserve">تالف</w:t>
+            </w:r>
+          </w:p>
+        </w:tc>
+      </w:tr>
+    </w:tbl>
+    <w:p>
+      <w:r>
+        <w:rPr>
+          <w:sz w:val="14"/>
+          <w:szCs w:val="14"/>
+        </w:rPr>
+        <w:t xml:space="preserve"> </w:t>
       </w:r>
     </w:p>
     <w:p>
@@ -5452,7 +6079,24 @@
           <w:sz w:val="20"/>
           <w:szCs w:val="20"/>
         </w:rPr>
-        <w:t xml:space="preserve">   • فلتر الحالة: تحت الفحص / تم الحل</w:t>
+        <w:t xml:space="preserve">   • عند التسوية يمكن تسجيل: عدد القطع والكراتين المُعادة + ملاحظة القرار</w:t>
+      </w:r>
+    </w:p>
+    <w:p>
+      <w:pPr>
+        <w:bidi/>
+        <w:spacing w:after="40" w:before="40"/>
+        <w:ind w:start="431"/>
+        <w:jc w:val="right"/>
+      </w:pPr>
+      <w:r>
+        <w:rPr>
+          <w:rFonts w:ascii="Cairo" w:cs="Cairo" w:eastAsia="Cairo" w:hAnsi="Cairo"/>
+          <w:color w:val="1E293B"/>
+          <w:sz w:val="20"/>
+          <w:szCs w:val="20"/>
+        </w:rPr>
+        <w:t xml:space="preserve">   • بعد التسوية تتغير حالة الحالة من 'تحت الفحص' إلى 'تمت التسوية' (أخضر)</w:t>
       </w:r>
     </w:p>
     <w:p>

</xml_diff>